<commit_message>
adding HMM Regime detection with its tests
</commit_message>
<xml_diff>
--- a/Report Draft/Chapter2-LiteratureReview.docx
+++ b/Report Draft/Chapter2-LiteratureReview.docx
@@ -317,21 +317,24 @@
         <w:t>continuous, non-linear residual dynamics conditional on that state</w:t>
       </w:r>
       <w:r>
-        <w:t xml:space="preserve"> that the Gaussian-emission HMM is deliberately too simple to capture. The regime-aware LSTM proposed in Chapter 3 makes this decomposition explicit by passing the smoothed state probabilities from the HMM as an additional input to the recurrent network.</w:t>
-      </w:r>
-    </w:p>
-    <w:p>
-      <w:r>
-        <w:t>The most direct empirical precedents are two studies of recurrent networks against econometric baselines on equity volatility, and reading them against each other is more instructive than taking either alone. Kim and Won (2018) work on daily KOSPI 200 data and hybridise an LSTM with several GARCH-type models, reporting that the hybrid beats either pure component. Bucci (2020) moves to the S&amp;P 500 but at monthly frequency, benchmarking feed-forward, LSTM and nonlinear autoregressive networks against ARFIMA and HAR, and finds the recurrent architectures the most accurate.</w:t>
-      </w:r>
-    </w:p>
-    <w:p>
-      <w:r>
-        <w:t xml:space="preserve">The two converge on a single claim saying that LSTM-based models can match or modestly exceed econometric baselines on equity volatility. Yet they reach it from opposite corners of the design space, where Kim and Won at daily frequency but on a return-based target in a </w:t>
+        <w:t xml:space="preserve"> that the Gaussian-emission HMM is deliberately too simple to capture. The regime-aware LSTM proposed in Chapter 3 makes this decomposition explicit by passing the </w:t>
+      </w:r>
+      <w:r>
+        <w:t>HMM's filtered state probabilities as an additional input to the recurrent network. In contrast to the smoothed probabilities of Section 2.4, which condition on the entire sample and are therefore suited to retrospective regime description, the filtered posterior P(sₜ | x₁,…,xₜ) conditions only on information available up to the forecast date, so conditioning the forecast on it introduces no look-ahead.</w:t>
+      </w:r>
+    </w:p>
+    <w:p>
+      <w:r>
+        <w:t xml:space="preserve">The most direct empirical precedents are two studies of recurrent networks against econometric baselines on equity volatility, and reading them against each other is more instructive than taking either alone. Kim and Won (2018) work on daily KOSPI 200 data and hybridise an LSTM with several GARCH-type models, reporting that the hybrid beats either pure component. Bucci (2020) moves to the S&amp;P 500 but at monthly frequency, </w:t>
       </w:r>
       <w:r>
         <w:lastRenderedPageBreak/>
-        <w:t>non-US market, and Bucci on a US index but at a monthly horizon that sidesteps the daily realised-volatility problem entirely. Neither conditions on market regime, neither produces calibrated uncertainty, and neither subjects its comparison to the proxy-robust significance tests of Section 2.7.</w:t>
+        <w:t>benchmarking feed-forward, LSTM and nonlinear autoregressive networks against ARFIMA and HAR, and finds the recurrent architectures the most accurate.</w:t>
+      </w:r>
+    </w:p>
+    <w:p>
+      <w:r>
+        <w:t>The two converge on a single claim saying that LSTM-based models can match or modestly exceed econometric baselines on equity volatility. Yet they reach it from opposite corners of the design space, where Kim and Won at daily frequency but on a return-based target in a non-US market, and Bucci on a US index but at a monthly horizon that sidesteps the daily realised-volatility problem entirely. Neither conditions on market regime, neither produces calibrated uncertainty, and neither subjects its comparison to the proxy-robust significance tests of Section 2.7.</w:t>
       </w:r>
     </w:p>
     <w:p>
@@ -391,7 +394,11 @@
         <w:t>Bayesian-approximate</w:t>
       </w:r>
       <w:r>
-        <w:t xml:space="preserve"> route that requires no architectural changes and no additional training. Pinball-loss quantile regression, motivated by the CAViaR framework of Engle and Manganelli (2004), supplies a </w:t>
+        <w:t xml:space="preserve"> route that requires no architectural changes and no additional training. Pinball-loss quantile </w:t>
+      </w:r>
+      <w:r>
+        <w:lastRenderedPageBreak/>
+        <w:t xml:space="preserve">regression, motivated by the CAViaR framework of Engle and Manganelli (2004), supplies a </w:t>
       </w:r>
       <w:r>
         <w:rPr>
@@ -405,11 +412,7 @@
     </w:p>
     <w:p>
       <w:r>
-        <w:t xml:space="preserve">The two are paired deliberately because their failure modes do not overlap. Dropout’s variational approximation may underestimate uncertainty under distribution shift, while </w:t>
-      </w:r>
-      <w:r>
-        <w:lastRenderedPageBreak/>
-        <w:t>quantile-regression intervals lack formal coverage guarantees and must be validated empirically. Reporting both, under the proper scoring rules of Gneiting and Raftery (2007), supplies a more defensible probabilistic forecast than either method alone.</w:t>
+        <w:t>The two are paired deliberately because their failure modes do not overlap. Dropout’s variational approximation may underestimate uncertainty under distribution shift, while quantile-regression intervals lack formal coverage guarantees and must be validated empirically. Reporting both, under the proper scoring rules of Gneiting and Raftery (2007), supplies a more defensible probabilistic forecast than either method alone.</w:t>
       </w:r>
     </w:p>
     <w:p>
@@ -461,17 +464,14 @@
       </w:pPr>
       <w:bookmarkStart w:id="7" w:name="forecast-evaluation-and-comparison"/>
       <w:r>
+        <w:lastRenderedPageBreak/>
         <w:t>2.7 Forecast Evaluation and Comparison</w:t>
       </w:r>
       <w:bookmarkEnd w:id="7"/>
     </w:p>
     <w:p>
       <w:r>
-        <w:t xml:space="preserve">The standard apparatus for testing whether one forecast is statistically more accurate than another is the pairwise test introduced by Diebold and Mariano (1995), which compares the loss differential between two competing forecasts and asks whether its mean is significantly </w:t>
-      </w:r>
-      <w:r>
-        <w:lastRenderedPageBreak/>
-        <w:t>different from zero under a heteroskedasticity- and autocorrelation-consistent estimate of its long-run variance. The test is widely used in volatility forecasting because it accommodates non-Gaussian loss differentials and non-nested model comparisons, both of which are common when comparing parametric econometric models against deep networks (Gu, Kelly and Xiu, 2020; Makridakis et al., 2020).</w:t>
+        <w:t>The standard apparatus for testing whether one forecast is statistically more accurate than another is the pairwise test introduced by Diebold and Mariano (1995), which compares the loss differential between two competing forecasts and asks whether its mean is significantly different from zero under a heteroskedasticity- and autocorrelation-consistent estimate of its long-run variance. The test is widely used in volatility forecasting because it accommodates non-Gaussian loss differentials and non-nested model comparisons, both of which are common when comparing parametric econometric models against deep networks (Gu, Kelly and Xiu, 2020; Makridakis et al., 2020).</w:t>
       </w:r>
     </w:p>
     <w:p>
@@ -547,11 +547,11 @@
         <w:t>probabilistic / uncertainty-quantification</w:t>
       </w:r>
       <w:r>
-        <w:t xml:space="preserve"> tradition provides two complementary routes to calibrated predictive distributions, the Monte Carlo Dropout (Gal and Ghahramani, 2016) and pinball-loss quantile regression rooted in CAViaR (Engle and Manganelli, 2004), evaluated against proper scoring rules (Gneiting and Raftery, 2007), and have been benchmarked extensively on general tasks but rarely on financial volatility. Across all four, </w:t>
+        <w:t xml:space="preserve"> tradition provides two complementary routes to calibrated predictive distributions, the Monte Carlo Dropout (Gal and Ghahramani, 2016) </w:t>
       </w:r>
       <w:r>
         <w:lastRenderedPageBreak/>
-        <w:t>the evidence is uneven (single-market, non-daily, or non-financial) and so indicative rather than decisive here.</w:t>
+        <w:t>and pinball-loss quantile regression rooted in CAViaR (Engle and Manganelli, 2004), evaluated against proper scoring rules (Gneiting and Raftery, 2007), and have been benchmarked extensively on general tasks but rarely on financial volatility. Across all four, the evidence is uneven (single-market, non-daily, or non-financial) and so indicative rather than decisive here.</w:t>
       </w:r>
     </w:p>
     <w:p>
@@ -647,6 +647,7 @@
     </w:p>
     <w:p>
       <w:r>
+        <w:lastRenderedPageBreak/>
         <w:t xml:space="preserve">Andersen, T.G., Bollerslev, T., Diebold, F.X. and Labys, P., 2003. Modeling and forecasting realized volatility. </w:t>
       </w:r>
       <w:r>
@@ -675,227 +676,227 @@
     </w:p>
     <w:p>
       <w:r>
+        <w:t xml:space="preserve">Barndorff-Nielsen, O.E., Hansen, P.R., Lunde, A. and Shephard, N., 2008. Designing realized kernels to measure the ex post variation of equity prices in the presence of noise. </w:t>
+      </w:r>
+      <w:r>
+        <w:rPr>
+          <w:i/>
+        </w:rPr>
+        <w:t>Econometrica</w:t>
+      </w:r>
+      <w:r>
+        <w:t>, 76(6), pp.1481–1536. https://doi.org/10.3982/ECTA6495</w:t>
+      </w:r>
+    </w:p>
+    <w:p>
+      <w:r>
+        <w:t>Blake, A.C., Gandhi, N.A. and Jakkula, A.R., 2025. Improving S&amp;P 500 volatility forecasting through regime-switching methods. arXiv preprint arXiv:2510.03236. https://doi.org/10.48550/arXiv.2510.03236</w:t>
+      </w:r>
+    </w:p>
+    <w:p>
+      <w:r>
+        <w:t xml:space="preserve">Bollerslev, T., 1986. Generalized autoregressive conditional heteroskedasticity. </w:t>
+      </w:r>
+      <w:r>
+        <w:rPr>
+          <w:i/>
+        </w:rPr>
+        <w:t>Journal of Econometrics</w:t>
+      </w:r>
+      <w:r>
+        <w:t>, 31(3), pp.307–327. https://doi.org/10.1016/0304-4076(86)90063-1</w:t>
+      </w:r>
+    </w:p>
+    <w:p>
+      <w:r>
+        <w:t xml:space="preserve">Bollerslev, T., Patton, A.J. and Quaedvlieg, R., 2016. Exploiting the errors: a simple approach for improved volatility forecasting. </w:t>
+      </w:r>
+      <w:r>
+        <w:rPr>
+          <w:i/>
+        </w:rPr>
+        <w:t>Journal of Econometrics</w:t>
+      </w:r>
+      <w:r>
+        <w:t>, 192(1), pp.1–18. https://doi.org/10.1016/j.jeconom.2015.10.007</w:t>
+      </w:r>
+    </w:p>
+    <w:p>
+      <w:r>
+        <w:t xml:space="preserve">Bucci, A., 2020. Realized volatility forecasting with neural networks. </w:t>
+      </w:r>
+      <w:r>
+        <w:rPr>
+          <w:i/>
+        </w:rPr>
+        <w:t>Journal of Financial Econometrics</w:t>
+      </w:r>
+      <w:r>
+        <w:t>, 18(3), pp.502–531. https://doi.org/10.1093/jjfinec/nbaa008</w:t>
+      </w:r>
+    </w:p>
+    <w:p>
+      <w:r>
+        <w:t xml:space="preserve">Christensen, K., Siggaard, M. and Veliyev, B., 2023. A machine learning approach to volatility forecasting. </w:t>
+      </w:r>
+      <w:r>
+        <w:rPr>
+          <w:i/>
+        </w:rPr>
+        <w:t>Journal of Financial Econometrics</w:t>
+      </w:r>
+      <w:r>
+        <w:t>, 21(5), pp.1680–1727. https://doi.org/10.1093/jjfinec/nbac020</w:t>
+      </w:r>
+    </w:p>
+    <w:p>
+      <w:r>
+        <w:t xml:space="preserve">Cont, R., 2001. Empirical properties of asset returns: stylized facts and statistical issues. </w:t>
+      </w:r>
+      <w:r>
+        <w:rPr>
+          <w:i/>
+        </w:rPr>
+        <w:t>Quantitative Finance</w:t>
+      </w:r>
+      <w:r>
+        <w:t>, 1(2), pp.223–236. https://doi.org/10.1080/713665670</w:t>
+      </w:r>
+    </w:p>
+    <w:p>
+      <w:r>
+        <w:t xml:space="preserve">Corsi, F., 2009. A simple approximate long-memory model of realized volatility. </w:t>
+      </w:r>
+      <w:r>
+        <w:rPr>
+          <w:i/>
+        </w:rPr>
+        <w:t>Journal of Financial Econometrics</w:t>
+      </w:r>
+      <w:r>
+        <w:t>, 7(2), pp.174–196. https://doi.org/10.1093/jjfinec/nbp001</w:t>
+      </w:r>
+    </w:p>
+    <w:p>
+      <w:r>
+        <w:t xml:space="preserve">Dacco, R. and Satchell, S., 1999. Why do regime-switching models forecast so badly? </w:t>
+      </w:r>
+      <w:r>
+        <w:rPr>
+          <w:i/>
+        </w:rPr>
+        <w:t>Journal of Forecasting</w:t>
+      </w:r>
+      <w:r>
+        <w:t>, 18(1), pp.1–16. https://doi.org/10.1002/(SICI)1099-131X(199901)18:1%3C1::AID-FOR685%3E3.0.CO;2-B</w:t>
+      </w:r>
+    </w:p>
+    <w:p>
+      <w:r>
+        <w:t xml:space="preserve">Diebold, F.X. and Mariano, R.S., 1995. Comparing predictive accuracy. </w:t>
+      </w:r>
+      <w:r>
+        <w:rPr>
+          <w:i/>
+        </w:rPr>
+        <w:t>Journal of Business &amp; Economic Statistics</w:t>
+      </w:r>
+      <w:r>
+        <w:t>, 13(3), pp.253–263. https://doi.org/10.1080/07350015.1995.10524599</w:t>
+      </w:r>
+    </w:p>
+    <w:p>
+      <w:r>
+        <w:t>Dudek, G., Orzeszko, W. and Fiszeder, P., 2025. Probabilistic forecasting cryptocurrencies volatility: from point to quantile forecasts. arXiv preprint arXiv:2508.15922. https://doi.org/10.48550/arXiv.2508.15922</w:t>
+      </w:r>
+    </w:p>
+    <w:p>
+      <w:r>
+        <w:t xml:space="preserve">Engle, R.F., 1982. Autoregressive conditional heteroscedasticity with estimates of the variance of United Kingdom inflation. </w:t>
+      </w:r>
+      <w:r>
+        <w:rPr>
+          <w:i/>
+        </w:rPr>
+        <w:t>Econometrica</w:t>
+      </w:r>
+      <w:r>
+        <w:t>, 50(4), pp.987–1007. https://doi.org/10.2307/1912773</w:t>
+      </w:r>
+    </w:p>
+    <w:p>
+      <w:r>
+        <w:t xml:space="preserve">Engle, R.F. and Manganelli, S., 2004. CAViaR: conditional autoregressive value at risk by regression quantiles. </w:t>
+      </w:r>
+      <w:r>
+        <w:rPr>
+          <w:i/>
+        </w:rPr>
+        <w:t>Journal of Business &amp; Economic Statistics</w:t>
+      </w:r>
+      <w:r>
+        <w:t>, 22(4), pp.367–381. https://doi.org/10.1198/073500104000000370</w:t>
+      </w:r>
+    </w:p>
+    <w:p>
+      <w:r>
+        <w:t xml:space="preserve">Erlwein-Sayer, C., Grimm, S., Pieper, A. and Alsac, R., 2023. Forecasting corporate credit spreads: regime-switching in LSTM. </w:t>
+      </w:r>
+      <w:r>
+        <w:rPr>
+          <w:i/>
+        </w:rPr>
+        <w:t>The Journal of Finance and Data Science</w:t>
+      </w:r>
+      <w:r>
+        <w:t>, 9. https://www.sciencedirect.com/science/article/pii/S2452306223000916</w:t>
+      </w:r>
+    </w:p>
+    <w:p>
+      <w:r>
+        <w:t xml:space="preserve">Frank, J., 2023. Forecasting realized volatility in turbulent times using temporal fusion transformers. </w:t>
+      </w:r>
+      <w:r>
+        <w:rPr>
+          <w:i/>
+        </w:rPr>
+        <w:t>FAU Discussion Papers in Economics</w:t>
+      </w:r>
+      <w:r>
+        <w:t>, No. 03/2023. https://ideas.repec.org/p/zbw/iwqwdp/032023.html</w:t>
+      </w:r>
+    </w:p>
+    <w:p>
+      <w:r>
+        <w:t xml:space="preserve">Gal, Y. and Ghahramani, Z., 2016. Dropout as a Bayesian approximation: representing model uncertainty in deep learning. In: </w:t>
+      </w:r>
+      <w:r>
+        <w:rPr>
+          <w:i/>
+        </w:rPr>
+        <w:t>Proceedings of the 33rd International Conference on Machine Learning (ICML)</w:t>
+      </w:r>
+      <w:r>
+        <w:t>, New York, USA, 19–24 June 2016. PMLR 48, pp.1050–1059.</w:t>
+      </w:r>
+    </w:p>
+    <w:p>
+      <w:r>
+        <w:t xml:space="preserve">Giacomini, R. and White, H., 2006. Tests of conditional predictive ability. </w:t>
+      </w:r>
+      <w:r>
+        <w:rPr>
+          <w:i/>
+        </w:rPr>
+        <w:t>Econometrica</w:t>
+      </w:r>
+      <w:r>
+        <w:t>, 74(6), pp.1545–1578. https://doi.org/10.1111/j.1468-0262.2006.00718.x</w:t>
+      </w:r>
+    </w:p>
+    <w:p>
+      <w:r>
         <w:lastRenderedPageBreak/>
-        <w:t xml:space="preserve">Barndorff-Nielsen, O.E., Hansen, P.R., Lunde, A. and Shephard, N., 2008. Designing realized kernels to measure the ex post variation of equity prices in the presence of noise. </w:t>
-      </w:r>
-      <w:r>
-        <w:rPr>
-          <w:i/>
-        </w:rPr>
-        <w:t>Econometrica</w:t>
-      </w:r>
-      <w:r>
-        <w:t>, 76(6), pp.1481–1536. https://doi.org/10.3982/ECTA6495</w:t>
-      </w:r>
-    </w:p>
-    <w:p>
-      <w:r>
-        <w:t>Blake, A.C., Gandhi, N.A. and Jakkula, A.R., 2025. Improving S&amp;P 500 volatility forecasting through regime-switching methods. arXiv preprint arXiv:2510.03236. https://doi.org/10.48550/arXiv.2510.03236</w:t>
-      </w:r>
-    </w:p>
-    <w:p>
-      <w:r>
-        <w:t xml:space="preserve">Bollerslev, T., 1986. Generalized autoregressive conditional heteroskedasticity. </w:t>
-      </w:r>
-      <w:r>
-        <w:rPr>
-          <w:i/>
-        </w:rPr>
-        <w:t>Journal of Econometrics</w:t>
-      </w:r>
-      <w:r>
-        <w:t>, 31(3), pp.307–327. https://doi.org/10.1016/0304-4076(86)90063-1</w:t>
-      </w:r>
-    </w:p>
-    <w:p>
-      <w:r>
-        <w:t xml:space="preserve">Bollerslev, T., Patton, A.J. and Quaedvlieg, R., 2016. Exploiting the errors: a simple approach for improved volatility forecasting. </w:t>
-      </w:r>
-      <w:r>
-        <w:rPr>
-          <w:i/>
-        </w:rPr>
-        <w:t>Journal of Econometrics</w:t>
-      </w:r>
-      <w:r>
-        <w:t>, 192(1), pp.1–18. https://doi.org/10.1016/j.jeconom.2015.10.007</w:t>
-      </w:r>
-    </w:p>
-    <w:p>
-      <w:r>
-        <w:t xml:space="preserve">Bucci, A., 2020. Realized volatility forecasting with neural networks. </w:t>
-      </w:r>
-      <w:r>
-        <w:rPr>
-          <w:i/>
-        </w:rPr>
-        <w:t>Journal of Financial Econometrics</w:t>
-      </w:r>
-      <w:r>
-        <w:t>, 18(3), pp.502–531. https://doi.org/10.1093/jjfinec/nbaa008</w:t>
-      </w:r>
-    </w:p>
-    <w:p>
-      <w:r>
-        <w:t xml:space="preserve">Christensen, K., Siggaard, M. and Veliyev, B., 2023. A machine learning approach to volatility forecasting. </w:t>
-      </w:r>
-      <w:r>
-        <w:rPr>
-          <w:i/>
-        </w:rPr>
-        <w:t>Journal of Financial Econometrics</w:t>
-      </w:r>
-      <w:r>
-        <w:t>, 21(5), pp.1680–1727. https://doi.org/10.1093/jjfinec/nbac020</w:t>
-      </w:r>
-    </w:p>
-    <w:p>
-      <w:r>
-        <w:t xml:space="preserve">Cont, R., 2001. Empirical properties of asset returns: stylized facts and statistical issues. </w:t>
-      </w:r>
-      <w:r>
-        <w:rPr>
-          <w:i/>
-        </w:rPr>
-        <w:t>Quantitative Finance</w:t>
-      </w:r>
-      <w:r>
-        <w:t>, 1(2), pp.223–236. https://doi.org/10.1080/713665670</w:t>
-      </w:r>
-    </w:p>
-    <w:p>
-      <w:r>
-        <w:t xml:space="preserve">Corsi, F., 2009. A simple approximate long-memory model of realized volatility. </w:t>
-      </w:r>
-      <w:r>
-        <w:rPr>
-          <w:i/>
-        </w:rPr>
-        <w:t>Journal of Financial Econometrics</w:t>
-      </w:r>
-      <w:r>
-        <w:t>, 7(2), pp.174–196. https://doi.org/10.1093/jjfinec/nbp001</w:t>
-      </w:r>
-    </w:p>
-    <w:p>
-      <w:r>
-        <w:t xml:space="preserve">Dacco, R. and Satchell, S., 1999. Why do regime-switching models forecast so badly? </w:t>
-      </w:r>
-      <w:r>
-        <w:rPr>
-          <w:i/>
-        </w:rPr>
-        <w:t>Journal of Forecasting</w:t>
-      </w:r>
-      <w:r>
-        <w:t>, 18(1), pp.1–16. https://doi.org/10.1002/(SICI)1099-131X(199901)18:1%3C1::AID-FOR685%3E3.0.CO;2-B</w:t>
-      </w:r>
-    </w:p>
-    <w:p>
-      <w:r>
-        <w:t xml:space="preserve">Diebold, F.X. and Mariano, R.S., 1995. Comparing predictive accuracy. </w:t>
-      </w:r>
-      <w:r>
-        <w:rPr>
-          <w:i/>
-        </w:rPr>
-        <w:t>Journal of Business &amp; Economic Statistics</w:t>
-      </w:r>
-      <w:r>
-        <w:t>, 13(3), pp.253–263. https://doi.org/10.1080/07350015.1995.10524599</w:t>
-      </w:r>
-    </w:p>
-    <w:p>
-      <w:r>
-        <w:t>Dudek, G., Orzeszko, W. and Fiszeder, P., 2025. Probabilistic forecasting cryptocurrencies volatility: from point to quantile forecasts. arXiv preprint arXiv:2508.15922. https://doi.org/10.48550/arXiv.2508.15922</w:t>
-      </w:r>
-    </w:p>
-    <w:p>
-      <w:r>
-        <w:t xml:space="preserve">Engle, R.F., 1982. Autoregressive conditional heteroscedasticity with estimates of the variance of United Kingdom inflation. </w:t>
-      </w:r>
-      <w:r>
-        <w:rPr>
-          <w:i/>
-        </w:rPr>
-        <w:t>Econometrica</w:t>
-      </w:r>
-      <w:r>
-        <w:t>, 50(4), pp.987–1007. https://doi.org/10.2307/1912773</w:t>
-      </w:r>
-    </w:p>
-    <w:p>
-      <w:r>
-        <w:t xml:space="preserve">Engle, R.F. and Manganelli, S., 2004. CAViaR: conditional autoregressive value at risk by regression quantiles. </w:t>
-      </w:r>
-      <w:r>
-        <w:rPr>
-          <w:i/>
-        </w:rPr>
-        <w:t>Journal of Business &amp; Economic Statistics</w:t>
-      </w:r>
-      <w:r>
-        <w:t>, 22(4), pp.367–381. https://doi.org/10.1198/073500104000000370</w:t>
-      </w:r>
-    </w:p>
-    <w:p>
-      <w:r>
-        <w:t xml:space="preserve">Erlwein-Sayer, C., Grimm, S., Pieper, A. and Alsac, R., 2023. Forecasting corporate credit spreads: regime-switching in LSTM. </w:t>
-      </w:r>
-      <w:r>
-        <w:rPr>
-          <w:i/>
-        </w:rPr>
-        <w:t>The Journal of Finance and Data Science</w:t>
-      </w:r>
-      <w:r>
-        <w:t>, 9. https://www.sciencedirect.com/science/article/pii/S2452306223000916</w:t>
-      </w:r>
-    </w:p>
-    <w:p>
-      <w:r>
-        <w:t xml:space="preserve">Frank, J., 2023. Forecasting realized volatility in turbulent times using temporal fusion transformers. </w:t>
-      </w:r>
-      <w:r>
-        <w:rPr>
-          <w:i/>
-        </w:rPr>
-        <w:t>FAU Discussion Papers in Economics</w:t>
-      </w:r>
-      <w:r>
-        <w:t>, No. 03/2023. https://ideas.repec.org/p/zbw/iwqwdp/032023.html</w:t>
-      </w:r>
-    </w:p>
-    <w:p>
-      <w:r>
-        <w:t xml:space="preserve">Gal, Y. and Ghahramani, Z., 2016. Dropout as a Bayesian approximation: representing model uncertainty in deep learning. In: </w:t>
-      </w:r>
-      <w:r>
-        <w:rPr>
-          <w:i/>
-        </w:rPr>
-        <w:t>Proceedings of the 33rd International Conference on Machine Learning (ICML)</w:t>
-      </w:r>
-      <w:r>
-        <w:t>, New York, USA, 19–24 June 2016. PMLR 48, pp.1050–1059.</w:t>
-      </w:r>
-    </w:p>
-    <w:p>
-      <w:r>
-        <w:t xml:space="preserve">Giacomini, R. and White, H., 2006. Tests of conditional predictive ability. </w:t>
-      </w:r>
-      <w:r>
-        <w:rPr>
-          <w:i/>
-        </w:rPr>
-        <w:t>Econometrica</w:t>
-      </w:r>
-      <w:r>
-        <w:t>, 74(6), pp.1545–1578. https://doi.org/10.1111/j.1468-0262.2006.00718.x</w:t>
-      </w:r>
-    </w:p>
-    <w:p>
-      <w:r>
         <w:t xml:space="preserve">Gibbs, I. and Candès, E., 2021. Adaptive conformal inference under distribution shift. In: </w:t>
       </w:r>
       <w:r>
@@ -924,7 +925,6 @@
     </w:p>
     <w:p>
       <w:r>
-        <w:lastRenderedPageBreak/>
         <w:t xml:space="preserve">Gneiting, T. and Raftery, A.E., 2007. Strictly proper scoring rules, prediction, and estimation. </w:t>
       </w:r>
       <w:r>
@@ -1154,6 +1154,7 @@
     </w:p>
     <w:p>
       <w:r>
+        <w:lastRenderedPageBreak/>
         <w:t xml:space="preserve">Lakshminarayanan, B., Pritzel, A. and Blundell, C., 2017. Simple and scalable predictive uncertainty estimation using deep ensembles. In: </w:t>
       </w:r>
       <w:r>
@@ -1182,7 +1183,6 @@
     </w:p>
     <w:p>
       <w:r>
-        <w:lastRenderedPageBreak/>
         <w:t xml:space="preserve">Lim, B. and Zohren, S., 2021. Time-series forecasting with deep learning: a survey. </w:t>
       </w:r>
       <w:r>
@@ -1426,6 +1426,7 @@
     </w:p>
     <w:p>
       <w:r>
+        <w:lastRenderedPageBreak/>
         <w:t xml:space="preserve">Zhang, L., Mykland, P.A. and Aït-Sahalia, Y., 2005. A tale of two time scales: determining integrated volatility with noisy high-frequency data. </w:t>
       </w:r>
       <w:r>
@@ -2229,7 +2230,6 @@
   <w:style w:type="character" w:default="1" w:styleId="DefaultParagraphFont">
     <w:name w:val="Default Paragraph Font"/>
     <w:uiPriority w:val="1"/>
-    <w:semiHidden/>
     <w:unhideWhenUsed/>
   </w:style>
   <w:style w:type="table" w:default="1" w:styleId="TableNormal">

</xml_diff>

<commit_message>
compressing chapter 2 to align with word counts
</commit_message>
<xml_diff>
--- a/Report Draft/Chapter2-LiteratureReview.docx
+++ b/Report Draft/Chapter2-LiteratureReview.docx
@@ -38,7 +38,7 @@
         <w:t>parametric econometric</w:t>
       </w:r>
       <w:r>
-        <w:t xml:space="preserve"> tradition, from Engle's (1982) ARCH to the GARCH family of conditional-variance specifications, supplies the parsimonious baselines any new proposal must beat. The </w:t>
+        <w:t xml:space="preserve"> tradition, from Engle's (1982) ARCH to the GARCH family, supplies the parsimonious baselines any new proposal must beat. The </w:t>
       </w:r>
       <w:r>
         <w:rPr>
@@ -47,15 +47,7 @@
         <w:t>regime-switching</w:t>
       </w:r>
       <w:r>
-        <w:t xml:space="preserve"> tradition treats markets as transitioning between qualitatively distinct latent states and supplies the machinery for extracting them from returns.</w:t>
-      </w:r>
-    </w:p>
-    <w:p>
-      <w:pPr>
-        <w:spacing w:line="360" w:lineRule="auto"/>
-      </w:pPr>
-      <w:r>
-        <w:t xml:space="preserve">The </w:t>
+        <w:t xml:space="preserve"> tradition treats markets as transitioning between qualitatively distinct latent states and supplies the machinery for extracting them from returns. The </w:t>
       </w:r>
       <w:r>
         <w:rPr>
@@ -73,25 +65,16 @@
         <w:t>probabilistic-machine-learning</w:t>
       </w:r>
       <w:r>
-        <w:t xml:space="preserve"> tradition converts point forecasts into calibrated predictive distributions through stochastic forward passes and direct quantile estimation. Underpinning all four, Andersen et al. (2003) define the dependent variable, Patton (2011) the proxy-robust losses, and Diebold and Mariano (1995) with Giacomini and White (2006) the apparatus for pairwise comparison.</w:t>
-      </w:r>
-    </w:p>
-    <w:p>
-      <w:pPr>
-        <w:spacing w:line="360" w:lineRule="auto"/>
-      </w:pPr>
-      <w:r>
-        <w:t>Two broader paradigms are acknowledged rather than surveyed: option-implied volatility, as the VIX and its model-free successors extract it from traded option prices, and ultra-high-frequency modelling of the tick-by-tick price process under microstructure noise. Each targets a different measurement object, and both are scoped out to keep the pipeline on daily realised volatility built from intraday returns.</w:t>
-      </w:r>
-    </w:p>
-    <w:p>
-      <w:pPr>
-        <w:spacing w:line="360" w:lineRule="auto"/>
-      </w:pPr>
-      <w:r>
-        <w:t>Each paper below is included because it supports a specific design decision in Chapter 3 — establishing a phenomenon the model must reproduce, defining a benchmark, supplying technical apparatus, or marking a competing approach the design weighs and sets aside. The chapter proceeds by workstream, in the order of the section headings.</w:t>
-      </w:r>
-      <w:r/>
+        <w:t xml:space="preserve"> tradition converts point forecasts into calibrated predictive distributions. Underpinning all four, Andersen et al. (2003) define the dependent variable, Patton (2011) the proxy-robust losses, and Diebold and Mariano (1995) with Giacomini and White (2006) the apparatus for pairwise comparison.</w:t>
+      </w:r>
+    </w:p>
+    <w:p>
+      <w:pPr>
+        <w:spacing w:line="360" w:lineRule="auto"/>
+      </w:pPr>
+      <w:r>
+        <w:t>Two broader paradigms are acknowledged rather than surveyed: option-implied volatility, as the VIX and its model-free successors extract it from traded option prices, and ultra-high-frequency modelling of the tick-by-tick price process under microstructure noise. Each targets a different measurement object, and both are scoped out to keep the pipeline on daily realised volatility built from intraday returns. Each paper below is included because it supports a specific design decision in Chapter 3 — establishing a phenomenon the model must reproduce, defining a benchmark, supplying technical apparatus, or marking a competing approach the design weighs and sets aside. The chapter proceeds by workstream.</w:t>
+      </w:r>
     </w:p>
     <w:p>
       <w:pPr>
@@ -109,65 +92,32 @@
         <w:spacing w:line="360" w:lineRule="auto"/>
       </w:pPr>
       <w:r>
-        <w:t>Any credible model of asset-return volatility must reproduce a small set of stylised facts: returns approximately uncorrelated despite strong serial dependence in their absolute and squared values, a leptokurtic unconditional distribution, volatility clustering, and negative shocks raising future variance more than positive shocks of equal magnitude (Cont, 2001). A specification that fails to capture them misprices tail risk and underreacts to crises.</w:t>
-      </w:r>
-    </w:p>
-    <w:p>
-      <w:pPr>
-        <w:spacing w:line="360" w:lineRule="auto"/>
-      </w:pPr>
-      <w:r>
-        <w:t>They serve two purposes here. They define the empirical contract against which the GARCH baselines and the deep models of Section 2.5 are judged; and they justify regime-aware estimation, since the magnitude and persistence of these features differ qualitatively across market environments and resist a single specification calibrated to the full sample.</w:t>
-      </w:r>
-    </w:p>
-    <w:p>
-      <w:pPr>
-        <w:spacing w:line="360" w:lineRule="auto"/>
-      </w:pPr>
-      <w:r>
-        <w:t>The most durable parametric response is the Generalised Autoregressive Conditional Heteroskedasticity model of Bollerslev (1986), which extends Engle's (1982) ARCH by expressing conditional variance as a linear function of past squared residuals and past conditional variances. GARCH(1,1) reduces this to two interpretable parameters — a short-run shock response and a longer-run persistence component — with a closed-form unconditional variance.</w:t>
-      </w:r>
-    </w:p>
-    <w:p>
-      <w:pPr>
-        <w:spacing w:line="360" w:lineRule="auto"/>
-      </w:pPr>
-      <w:r>
-        <w:t>Its limitations are well documented: Gaussian innovations understate tail risk, the symmetric variance equation cannot accommodate the leverage effect, and one parameter vector is assumed stable across regimes. The stochastic-volatility alternative (Taylor, 1986) is set aside because its likelihood demands simulation-based filtering (Kim, Shephard and Chib, 1998), whereas the observation-driven GARCH variance is estimated directly. GARCH(1,1) is the primary econometric baseline not for sophistication but as the standard any alternative must beat.</w:t>
-      </w:r>
-    </w:p>
-    <w:p>
-      <w:pPr>
-        <w:spacing w:line="360" w:lineRule="auto"/>
-      </w:pPr>
-      <w:r>
-        <w:t>The leverage effect drew two competing parametric responses. The Exponential GARCH of Nelson (1991) models the logarithm of conditional variance, guaranteeing positivity without parameter restrictions, with innovations entering through both sign and magnitude so that asymmetry is captured by a smooth functional form; the GJR-GARCH of Glosten, Jagannathan and Runkle (1993) reaches the same target in levels, adding one threshold term that activates only for negative shocks — more parsimonious, but discontinuous.</w:t>
-      </w:r>
-    </w:p>
-    <w:p>
-      <w:pPr>
-        <w:spacing w:line="360" w:lineRule="auto"/>
-      </w:pPr>
-      <w:r>
-        <w:t>The two encode an identical stylised fact through contrasting mechanisms, and the literature has never decisively separated them. EGARCH is the second econometric baseline because it isolates one dimension along which GARCH(1,1) is demonstrably deficient: comparing the regime-aware deep model against both tests whether any improvement reflects genuine non-linear learning of regime-dependent dynamics, or merely an asymmetric response an asymmetric parametric model already captures within a single regime.</w:t>
-      </w:r>
-    </w:p>
-    <w:p>
-      <w:pPr>
-        <w:spacing w:line="360" w:lineRule="auto"/>
-      </w:pPr>
-      <w:r>
-        <w:t>The bar remains high. Hansen and Lunde's (2005) comparison of 330 GARCH-family specifications found that, under proxy-robust losses, none of the elaborate specifications improved significantly on plain GARCH(1,1) for exchange-rate volatility; the equity result was more nuanced, with asymmetric specifications such as EGARCH and GJR-GARCH sometimes preferred.</w:t>
-      </w:r>
-    </w:p>
-    <w:p>
-      <w:pPr>
-        <w:spacing w:line="360" w:lineRule="auto"/>
-      </w:pPr>
-      <w:r>
-        <w:t>An alternative must therefore deliver out-of-sample gains that survive scrutiny under proxy-robust losses, not merely fit better in-sample. One caveat tempers the benchmark: it is two decades old and was conducted largely on daily-return proxies rather than the high-frequency realised targets used here, so whether the GARCH(1,1) floor still binds is treated as testable rather than settled — a further reason to retain both as live baselines, and a motivation for the testing of Section 2.7.</w:t>
-      </w:r>
-      <w:r/>
+        <w:t>Any credible model of asset-return volatility must reproduce a small set of stylised facts: returns approximately uncorrelated despite strong serial dependence in their absolute and squared values, a leptokurtic unconditional distribution, volatility clustering, and negative shocks raising future variance more than positive shocks of equal magnitude (Cont, 2001). They serve two purposes here: they define the empirical contract against which the GARCH baselines and the deep models of Section 2.5 are judged, and they justify regime-aware estimation, since the magnitude and persistence of these features differ qualitatively across market environments and resist a single specification calibrated to the full sample.</w:t>
+      </w:r>
+    </w:p>
+    <w:p>
+      <w:pPr>
+        <w:spacing w:line="360" w:lineRule="auto"/>
+      </w:pPr>
+      <w:r>
+        <w:t>Bollerslev's (1986) Generalised Autoregressive Conditional Heteroskedasticity model extends Engle's (1982) ARCH by expressing conditional variance as a linear function of past squared residuals and past conditional variances; GARCH(1,1) reduces this to a short-run shock response, a longer-run persistence component and a closed-form unconditional variance. Its limitations are well documented: Gaussian innovations understate tail risk, the symmetric variance equation cannot accommodate the leverage effect, and one parameter vector is assumed stable across regimes. The stochastic-volatility alternative (Taylor, 1986) is set aside because its likelihood demands simulation-based filtering (Kim, Shephard and Chib, 1998), whereas the observation-driven GARCH variance is estimated directly. It is the primary econometric baseline not for sophistication but as the standard any alternative must beat.</w:t>
+      </w:r>
+    </w:p>
+    <w:p>
+      <w:pPr>
+        <w:spacing w:line="360" w:lineRule="auto"/>
+      </w:pPr>
+      <w:r>
+        <w:t>The leverage effect drew two competing responses. Nelson's (1991) Exponential GARCH models the logarithm of conditional variance, so positivity holds without parameter restrictions and innovations enter through both sign and magnitude; the GJR-GARCH of Glosten, Jagannathan and Runkle (1993) reaches the same target in levels through a single threshold term that activates only for negative shocks — more parsimonious, but discontinuous. The two encode an identical stylised fact through contrasting mechanisms, and the literature has never decisively separated them. EGARCH is the second econometric baseline because it isolates one dimension along which GARCH(1,1) is demonstrably deficient: comparing the regime-aware deep model against both tests whether an improvement reflects genuine non-linear learning of regime-dependent dynamics, or merely an asymmetry a parametric model already captures within a single regime.</w:t>
+      </w:r>
+    </w:p>
+    <w:p>
+      <w:pPr>
+        <w:spacing w:line="360" w:lineRule="auto"/>
+      </w:pPr>
+      <w:r>
+        <w:t>The bar remains high: Hansen and Lunde's (2005) comparison of 330 GARCH-family specifications found none improving significantly on plain GARCH(1,1) under proxy-robust losses for exchange-rate volatility, though the equity result was more nuanced and asymmetric specifications such as EGARCH and GJR-GARCH were sometimes preferred. An alternative must therefore deliver out-of-sample gains that survive proxy-robust scrutiny, not merely fit better in-sample. One caveat tempers that benchmark: it is two decades old and was conducted largely on daily-return proxies rather than the high-frequency realised targets used here, so whether the GARCH(1,1) floor still binds is treated as testable rather than settled — a further reason to retain both as live baselines, and a motivation for the testing of Section 2.7.</w:t>
+      </w:r>
     </w:p>
     <w:p>
       <w:pPr>
@@ -206,40 +156,23 @@
         <w:spacing w:line="360" w:lineRule="auto"/>
       </w:pPr>
       <w:r>
-        <w:t>It is on this observable target rather than on return-based proxies that neural architectures have most consistently outperformed parametric alternatives (Bucci, 2020; Christensen, Siggaard and Veliyev, 2023). The dissertation adopts daily realised volatility in the Andersen et al. (2003) sense throughout, obtained for the S&amp;P 500 from the Oxford-Man Realized Library (Heber et al., 2009).</w:t>
-      </w:r>
-    </w:p>
-    <w:p>
-      <w:pPr>
-        <w:spacing w:line="360" w:lineRule="auto"/>
-      </w:pPr>
-      <w:r>
-        <w:t>Once realised volatility is the target, the loss function acquires direct inferential consequence. Patton (2011) establishes that when conditional variance is replaced by a noisy proxy, only a restricted family of losses yields rankings robust to that noise: mean squared error remains valid and QLIKE has particularly attractive properties, while losses outside the family can reverse the ordering of two models.</w:t>
-      </w:r>
-    </w:p>
-    <w:p>
-      <w:pPr>
-        <w:spacing w:line="360" w:lineRule="auto"/>
-      </w:pPr>
-      <w:r>
-        <w:t>QLIKE also penalises under-prediction more heavily than over-prediction, aligning the objective with the asymmetric cost of underestimating risk. It is adopted as the primary out-of-sample metric, with mean squared error reported as a robustness check.</w:t>
-      </w:r>
-      <w:r/>
-    </w:p>
-    <w:p>
-      <w:pPr>
-        <w:spacing w:line="360" w:lineRule="auto"/>
-      </w:pPr>
-      <w:r>
-        <w:t>A second development of equal practical importance is Corsi's (2009) heterogeneous autoregressive model of realised volatility, which decomposes the conditional expectation of daily realised variance into linear contributions from daily, weekly and monthly lagged components. The heterogeneous structure captures persistence parsimoniously and routinely matches or exceeds fractionally integrated alternatives on equity indices.</w:t>
-      </w:r>
-    </w:p>
-    <w:p>
-      <w:pPr>
-        <w:spacing w:line="360" w:lineRule="auto"/>
-      </w:pPr>
-      <w:r>
-        <w:t>Its extensions — HARQ, which corrects for measurement error (Bollerslev, Patton and Quaedvlieg, 2016), and the joint return-and-RV Realized GARCH (Hansen, Huang and Shek, 2012) — refine but do not displace it. HAR-RV is the de facto benchmark on realised-volatility targets and is the third econometric baseline: a deep forecaster that fails to beat it on its native target is not a credible alternative.</w:t>
+        <w:t>It is on this observable target rather than on return-based proxies that neural architectures have most consistently outperformed parametric alternatives (Bucci, 2020; Christensen, Siggaard and Veliyev, 2023). The dissertation adopts it throughout, in the Andersen et al. (2003) sense and from the Oxford-Man Realized Library (Heber et al., 2009).</w:t>
+      </w:r>
+    </w:p>
+    <w:p>
+      <w:pPr>
+        <w:spacing w:line="360" w:lineRule="auto"/>
+      </w:pPr>
+      <w:r>
+        <w:t>Once realised volatility is the target, the loss function acquires direct inferential consequence. Patton (2011) establishes that when conditional variance is replaced by a noisy proxy, only a restricted family of losses yields rankings robust to that noise: mean squared error remains valid and QLIKE has particularly attractive properties, while losses outside the family can reverse the ordering of two models. QLIKE also penalises under-prediction more heavily than over-prediction, aligning the objective with the asymmetric cost of underestimating risk; it is adopted as the primary out-of-sample metric, with mean squared error as a robustness check.</w:t>
+      </w:r>
+    </w:p>
+    <w:p>
+      <w:pPr>
+        <w:spacing w:line="360" w:lineRule="auto"/>
+      </w:pPr>
+      <w:r>
+        <w:t>A second development of equal practical importance is Corsi's (2009) heterogeneous autoregressive model of realised volatility, which decomposes the conditional expectation of daily realised variance into linear contributions from daily, weekly and monthly lagged components, capturing persistence parsimoniously and routinely matching or exceeding fractionally integrated alternatives on equity indices. Its extensions — HARQ, which corrects for measurement error (Bollerslev, Patton and Quaedvlieg, 2016), and the joint return-and-RV Realized GARCH (Hansen, Huang and Shek, 2012) — refine but do not displace it. HAR-RV is the de facto benchmark on realised-volatility targets and is the third econometric baseline: a deep forecaster that fails to beat it on its native target is not a credible alternative.</w:t>
       </w:r>
     </w:p>
     <w:p>
@@ -266,10 +199,7 @@
         <w:spacing w:line="360" w:lineRule="auto"/>
       </w:pPr>
       <w:r>
-        <w:t>Smoothed state probabilities give interpretable retrospective inference, but forecasting must rely on filtered probabilities, which estimate the active regime from information available up to each date and so avoid look-ahead bias. Within that framework</w:t>
-      </w:r>
-      <w:r>
-        <w:t xml:space="preserve">, the dissertation adopts a </w:t>
+        <w:t xml:space="preserve">Smoothed state probabilities give interpretable retrospective inference, but forecasting must rely on filtered probabilities, which estimate the active regime from information available up to each date and so avoid look-ahead bias. Within that framework, the dissertation adopts a </w:t>
       </w:r>
       <w:r>
         <w:rPr>
@@ -278,15 +208,7 @@
         <w:t>Gaussian-emission Hidden Markov Model</w:t>
       </w:r>
       <w:r>
-        <w:t xml:space="preserve"> rather than a Markov-switching autoregression, each regime parameterised as a Gaussian distribution over standardised daily log returns.</w:t>
-      </w:r>
-    </w:p>
-    <w:p>
-      <w:pPr>
-        <w:spacing w:line="360" w:lineRule="auto"/>
-      </w:pPr>
-      <w:r>
-        <w:t>The choice is deliberate: the Gaussian-emission form keeps the regime model simple, leaving the non-linear within-regime structure to the LSTM of Section 2.5 and avoiding the identification difficulties of estimating switching and within-regime dynamics jointly. Whether regime-switching improves out-of-sample forecasts is contested — Dacco and Satchell (1999) found such models forecasting poorly despite strong in-sample fit, though regimes add value in asset allocation (Ang and Bekaert, 2002) — so the dissertation tests it rather than assuming it.</w:t>
+        <w:t xml:space="preserve"> rather than a Markov-switching autoregression, each regime parameterised as a Gaussian over standardised daily log returns. The choice keeps the regime model simple, leaving the non-linear within-regime structure to the LSTM of Section 2.5 and avoiding the identification difficulties of estimating switching and within-regime dynamics jointly. Whether regime-switching improves out-of-sample forecasts is contested — Dacco and Satchell (1999) found such models forecasting poorly despite strong in-sample fit, though regimes add value in asset allocation (Ang and Bekaert, 2002) — so the dissertation tests it rather than assuming it.</w:t>
       </w:r>
     </w:p>
     <w:p>
@@ -308,18 +230,18 @@
         <w:rPr>
           <w:b/>
         </w:rPr>
-        <w:t>The dissertation operationalises the Nystrup et al. (2020) jump penalty in the two-stage form those authors describe: the penalised objective is solved for a persistent state path, and the hidden Markov model's emissions and transition matrix are estimated from it, so the filtered posterior inherits that persistence rather than maximum likelihood's excessive switching.</w:t>
-      </w:r>
-      <w:r>
-        <w:t xml:space="preserve"> The penalty's strength governs a bias-variance trade-off between over-smoothed and over-switching state sequences, and is tuned rather than set a priori.</w:t>
-      </w:r>
-    </w:p>
-    <w:p>
-      <w:pPr>
-        <w:spacing w:line="360" w:lineRule="auto"/>
-      </w:pPr>
-      <w:r>
-        <w:t>The number of regimes is kept small and interpretable — broadly calm, transitional and crisis — because a richer state space dilutes interpretability and invites overfitting on the modest samples of daily financial data (Guidolin, 2011). Chapter 3 specifies the estimation and tuning procedures.</w:t>
+        <w:t>The dissertation operationalises the Nystrup et al. (2020) jump penalty in the two-stage form those authors describe</w:t>
+      </w:r>
+      <w:r>
+        <w:t>, so the filtered posterior inherits a persistent state path rather than maximum likelihood's excessive switching. The penalty's strength governs a bias-variance trade-off between over-smoothed and over-switching state sequences, and is tuned rather than set a priori.</w:t>
+      </w:r>
+    </w:p>
+    <w:p>
+      <w:pPr>
+        <w:spacing w:line="360" w:lineRule="auto"/>
+      </w:pPr>
+      <w:r>
+        <w:t>The number of regimes is kept small and interpretable — broadly calm, transitional and crisis — because a richer state space dilutes interpretability and invites overfitting on the modest samples of daily financial data (Guidolin, 2011).</w:t>
       </w:r>
     </w:p>
     <w:p>
@@ -363,36 +285,56 @@
         <w:spacing w:line="360" w:lineRule="auto"/>
       </w:pPr>
       <w:r>
-        <w:t>Lim and Zohren's (2021) survey supplies the design vocabulary used here. Two of its principles bear directly on volatility: financial sequences benefit from architectures with strong temporal inductive bias, their effective sample sizes being small relative to language or vision tasks; and hybrids in which a network learns residual structure on top of a statistical baseline frequently outperform either component alone.</w:t>
-      </w:r>
-    </w:p>
-    <w:p>
-      <w:pPr>
-        <w:spacing w:line="360" w:lineRule="auto"/>
-      </w:pPr>
-      <w:r>
-        <w:t>Both motivate the regime-aware variant of Chapter 3, in which the network is conditioned on an external state estimate rather than expected to learn regime structure unsupervised.</w:t>
-      </w:r>
-      <w:r>
-        <w:rPr>
-          <w:bCs/>
-        </w:rPr>
-      </w:r>
-      <w:r/>
-    </w:p>
-    <w:p>
-      <w:pPr>
-        <w:spacing w:line="360" w:lineRule="auto"/>
-      </w:pPr>
-      <w:r>
-        <w:t>The division of labour is precise: the hidden Markov model of Section 2.4 resolves the discrete regime-identification problem that a single-regime parametric specification cannot accommodate, while the LSTM resolves the continuous, non-linear residual dynamics conditional on that state, which the Gaussian-emission HMM is deliberately too simple to capture. Chapter 3 makes the decomposition explicit through two conditioning architectures, one supplying the state posterior as a feature and one gating a mixture of per-state experts (Jacobs et al., 1991) with it. Because that posterior is filtered rather than smoothed, conditioning on it introduces no look-ahead.</w:t>
-      </w:r>
-      <w:r>
-        <w:rPr>
-          <w:bCs/>
-        </w:rPr>
-      </w:r>
-      <w:r/>
+        <w:t>Lim and Zohren's (2021) survey supplies the design vocabulary used here. Two of its principles bear directly on volatility: financial sequences benefit from architectures with strong temporal inductive bias, their effective sample sizes being small relative to language or vision tasks; and hybrids in which a network learns residual structure on top of a statistical baseline frequently outperform either component alone. Both motivate conditioning the network on an external state estimate rather than expecting it to learn regime structure unsupervised.</w:t>
+      </w:r>
+    </w:p>
+    <w:p>
+      <w:pPr>
+        <w:spacing w:line="360" w:lineRule="auto"/>
+      </w:pPr>
+      <w:r>
+        <w:t>The division of labour is precise: the hidden Markov model of Section 2.4 resolves the discrete regime-identification problem that a single-regime parametric specification cannot accommodate, while the LSTM resolves the continuous, non-linear residual dynamics conditional on that state, which the Gaussian-emission HMM is deliberately too simple to capture. Chapter 3 makes that decomposition explicit, including the mixture of per-state experts of Jacobs et al. (1991).</w:t>
+      </w:r>
+    </w:p>
+    <w:p>
+      <w:pPr>
+        <w:spacing w:line="360" w:lineRule="auto"/>
+      </w:pPr>
+      <w:r>
+        <w:t>The most direct empirical precedents are two studies of recurrent networks against econometric baselines, more instructive read against each other than alone. Kim and Won (2018) hybridise an LSTM with GARCH-type models on daily KOSPI 200 data and report the hybrid beating either component; Bucci (2020) benchmarks feed-forward, LSTM and nonlinear autoregressive networks against ARFIMA and HAR on the S&amp;P 500 at monthly frequency and finds the recurrent architectures most accurate. They converge on one claim — LSTM-based models can match or modestly exceed econometric baselines on equity volatility — from opposite corners of the design space: daily frequency but a return-based target in a non-US market, against a US index at a horizon that sidesteps the daily realised-volatility problem. Neither conditions on regime, produces calibrated uncertainty, or applies proxy-robust significance tests.</w:t>
+      </w:r>
+    </w:p>
+    <w:p>
+      <w:pPr>
+        <w:spacing w:line="360" w:lineRule="auto"/>
+      </w:pPr>
+      <w:r>
+        <w:t>Those are the four gaps the dissertation closes jointly: daily realised volatility on a major US index, regime conditioning, calibrated uncertainty and proxy-robust testing. More recent work modernises the base — Christensen, Siggaard and Veliyev (2023) show machine learning outperforming HAR on daily realised volatility, while Reisenhofer, Bayer and Hautsch (2022) remains an arXiv preprint and is read as indicative — and a wave of very recent studies sharpens the precedents further, each occupying only part of the pipeline assembled here; Table 2.1 sets out the comparison. The closest comparator, Kılıç (2025), finds regime-switching HAR specifications outperforming deep models on daily S&amp;P 500 realised volatility under QLIKE — a result this dissertation confronts by placing the regime signal inside the network rather than the HAR, and testing whether the conclusion survives once uncertainty is added.</w:t>
+      </w:r>
+    </w:p>
+    <w:p>
+      <w:pPr>
+        <w:spacing w:line="360" w:lineRule="auto"/>
+      </w:pPr>
+    </w:p>
+    <w:p>
+      <w:pPr>
+        <w:pStyle w:val="Heading2"/>
+        <w:spacing w:line="360" w:lineRule="auto"/>
+      </w:pPr>
+      <w:bookmarkStart w:id="6" w:name="X52a78444787454871f991dd5dc3eed38c292db5"/>
+      <w:r>
+        <w:t>2.6 Uncertainty Quantification in Deep Forecasting</w:t>
+      </w:r>
+      <w:bookmarkEnd w:id="6"/>
+    </w:p>
+    <w:p>
+      <w:pPr>
+        <w:spacing w:line="360" w:lineRule="auto"/>
+      </w:pPr>
+      <w:r>
+        <w:t>Two complementary uncertainty-quantification methods are adopted, balancing computational cost against econometric robustness. Deep ensembles (Lakshminarayanan, Pritzel and Blundell, 2017) and full Bayesian inference were set aside on cost. Monte Carlo Dropout (Gal and Ghahramani, 2016) needs no architectural change and no extra training; pinball-loss quantile regression (Koenker and Bassett, 1978), motivated by CAViaR (Engle and Manganelli, 2004), imposes no parametric assumption on the conditional distribution.</w:t>
+      </w:r>
       <w:r>
         <w:rPr>
           <w:bCs/>
@@ -400,129 +342,95 @@
       </w:r>
       <w:r/>
       <w:r/>
-    </w:p>
-    <w:p>
-      <w:pPr>
-        <w:spacing w:line="360" w:lineRule="auto"/>
-      </w:pPr>
-      <w:r>
-        <w:t>The most direct empirical precedents are two studies of recurrent networks against econometric baselines, more instructive read against each other than alone. Kim and Won (2018) hybridise an LSTM with GARCH-type models on daily KOSPI 200 data and report the hybrid beating either component; Bucci (2020) benchmarks feed-forward, LSTM and nonlinear autoregressive networks against ARFIMA and HAR on the S&amp;P 500 at monthly frequency and finds the recurrent architectures most accurate.</w:t>
-      </w:r>
-    </w:p>
-    <w:p>
-      <w:pPr>
-        <w:spacing w:line="360" w:lineRule="auto"/>
-      </w:pPr>
-      <w:r>
-        <w:t>They converge on one claim — LSTM-based models can match or modestly exceed econometric baselines on equity volatility — from opposite corners of the design space: daily frequency but a return-based target in a non-US market, against a US index at a horizon that sidesteps the daily realised-volatility problem. Neither conditions on regime, produces calibrated uncertainty, or applies proxy-robust significance tests.</w:t>
-      </w:r>
-    </w:p>
-    <w:p>
-      <w:pPr>
-        <w:spacing w:line="360" w:lineRule="auto"/>
-      </w:pPr>
-      <w:r>
-        <w:t>Those are the four gaps the dissertation closes jointly: daily realised volatility on a major US index, regime conditioning, calibrated uncertainty and proxy-robust testing. More recent work modernises the base — Christensen, Siggaard and Veliyev (2023) show machine learning outperforming HAR on daily realised volatility, while Reisenhofer, Bayer and Hautsch (2022) remains an arXiv preprint and is read as indicative — but neither addresses the four jointly.</w:t>
+      <w:r>
+        <w:rPr>
+          <w:bCs/>
+        </w:rPr>
       </w:r>
       <w:r/>
-    </w:p>
-    <w:p>
-      <w:pPr>
-        <w:spacing w:line="360" w:lineRule="auto"/>
-      </w:pPr>
-      <w:r>
-        <w:t>A wave of very recent work sharpens these precedents, each study occupying only part of the pipeline assembled here; Table 2.1 in Section 2.8 sets out the comparison. The closest comparator, Kılıç (2025), finds regime-switching HAR specifications outperforming deep models on daily S&amp;P 500 realised volatility under QLIKE — a result this dissertation confronts by placing the regime signal inside the network rather than the HAR, and testing whether the conclusion survives once uncertainty is added.</w:t>
-      </w:r>
-    </w:p>
-    <w:p>
-      <w:pPr>
-        <w:spacing w:line="360" w:lineRule="auto"/>
-      </w:pPr>
+      <w:r>
+        <w:rPr>
+          <w:bCs/>
+        </w:rPr>
+      </w:r>
+      <w:r/>
+      <w:r>
+        <w:t xml:space="preserve"> They are paired because their failure modes do not overlap: dropout’s variational approximation may understate uncertainty under distribution shift, while quantile-regression intervals lack formal coverage guarantees and must be validated empirically.</w:t>
+      </w:r>
+    </w:p>
+    <w:p>
+      <w:pPr>
+        <w:spacing w:line="360" w:lineRule="auto"/>
+      </w:pPr>
+      <w:r>
+        <w:t>Gal and Ghahramani (2016) show that a network trained with dropout can be reinterpreted as approximate Bayesian inference over a deep Gaussian-process prior, stochastic passes at test time sampling the posterior predictive distribution. Its documented limitation is that the dropout rate acts as a hyperparameter materially affecting predictive variance, and that estimates can be over-confident under distribution shift — the regime that dominates financial test periods (Ovadia et al., 2019).</w:t>
+      </w:r>
+    </w:p>
+    <w:p>
+      <w:pPr>
+        <w:spacing w:line="360" w:lineRule="auto"/>
+      </w:pPr>
+      <w:r>
+        <w:t>Engle and Manganelli (2004) introduced the Conditional Autoregressive Value at Risk framework, modelling conditional quantiles through an autoregressive recursion estimated by minimising the pinball loss. That distribution-free loss was later adopted by neural quantile regression and refined for finite-sample coverage by conformal methods (Romano, Patterson and Candès, 2019; Xu and Xie, 2021; Gibbs and Candès, 2021), which are acknowledged rather than adopted: conformal calibration needs a held-out set disjoint from both training data and evaluation window, and the pre-test sample here is committed in full to estimating models held fixed across the test period.</w:t>
+      </w:r>
+    </w:p>
+    <w:p>
+      <w:pPr>
+        <w:spacing w:line="360" w:lineRule="auto"/>
+      </w:pPr>
+      <w:r>
+        <w:t>CAViaR therefore justifies training the LSTM to output conditional quantiles directly rather than sampling a posterior. It imposes no distributional assumption and remains valid for heavy-tailed returns, but the estimated quantiles are not guaranteed monotonic and the intervals lack the finite-sample coverage guarantees of Bayesian or conformal procedures, so their empirical coverage must be established rather than assumed.</w:t>
+      </w:r>
+    </w:p>
+    <w:p>
+      <w:pPr>
+        <w:spacing w:line="360" w:lineRule="auto"/>
+      </w:pPr>
+      <w:r>
+        <w:t>Two recent studies bring these ideas onto realised volatility itself and are the dissertation's nearest probabilistic neighbours, each stopping short of the present design; Table 2.1 records what each omits. That the full stack composes is shown outside finance by Isik and Yalcinkaya (2026), who integrate regime detection, a bidirectional LSTM, Monte Carlo Dropout and quantile intervals end-to-end for wind-power forecasting, while its financial instantiation remains unoccupied. Gunnarsson et al. (2024) underscore the point: they find deep recurrent models among the strongest realised-volatility forecasters yet explicitly identify probabilistic, uncertainty-aware machine learning as an open direction.</w:t>
+      </w:r>
     </w:p>
     <w:p>
       <w:pPr>
         <w:pStyle w:val="Heading2"/>
         <w:spacing w:line="360" w:lineRule="auto"/>
       </w:pPr>
-      <w:bookmarkStart w:id="6" w:name="X52a78444787454871f991dd5dc3eed38c292db5"/>
-      <w:r>
-        <w:t>2.6 Uncertainty Quantification in Deep Forecasting</w:t>
-      </w:r>
-      <w:bookmarkEnd w:id="6"/>
-    </w:p>
-    <w:p>
-      <w:pPr>
-        <w:spacing w:line="360" w:lineRule="auto"/>
-      </w:pPr>
-      <w:r>
-        <w:t>Two complementary uncertainty-quantification methods are adopted, balancing computational cost against econometric robustness. Deep ensembles (Lakshminarayanan, Pritzel and Blundell, 2017) and full Bayesian inference were set aside on cost. Monte Carlo Dropout (Gal and Ghahramani, 2016) needs no architectural change and no extra training; pinball-loss quantile regression (Koenker and Bassett, 1978), motivated by CAViaR (Engle and Manganelli, 2004), imposes no parametric assumption on the conditional distribution.</w:t>
-      </w:r>
-      <w:r>
-        <w:rPr>
-          <w:bCs/>
-        </w:rPr>
-      </w:r>
-      <w:r/>
-      <w:r/>
-      <w:r>
-        <w:rPr>
-          <w:bCs/>
-        </w:rPr>
-      </w:r>
-      <w:r/>
-      <w:r>
-        <w:rPr>
-          <w:bCs/>
-        </w:rPr>
-      </w:r>
-      <w:r/>
-    </w:p>
-    <w:p>
-      <w:pPr>
-        <w:spacing w:line="360" w:lineRule="auto"/>
-      </w:pPr>
-      <w:r>
-        <w:t>They are paired because their failure modes do not overlap: dropout's variational approximation may understate uncertainty under distribution shift, while quantile-regression intervals lack formal coverage guarantees and must be validated empirically. Reporting both under the proper scoring rules of Gneiting and Raftery (2007) is more defensible than either alone.</w:t>
-      </w:r>
-    </w:p>
-    <w:p>
-      <w:pPr>
-        <w:spacing w:line="360" w:lineRule="auto"/>
-      </w:pPr>
-      <w:r>
-        <w:t>Gal and Ghahramani (2016) show that a network trained with dropout can be reinterpreted as approximate Bayesian inference over a deep Gaussian-process prior, stochastic passes at test time sampling the posterior predictive distribution. Its documented limitation is that the dropout rate acts as a hyperparameter materially affecting predictive variance, and that estimates can be over-confident under distribution shift — the regime that dominates financial test periods (Ovadia et al., 2019). Calibration is therefore validated against held-out coverage.</w:t>
-      </w:r>
-    </w:p>
-    <w:p>
-      <w:pPr>
-        <w:spacing w:line="360" w:lineRule="auto"/>
-      </w:pPr>
-      <w:r>
-        <w:t>Engle and Manganelli (2004) introduced the Conditional Autoregressive Value at Risk framework, modelling conditional quantiles through an autoregressive recursion estimated by minimising the pinball loss. That same distribution-free loss was later adopted by neural quantile regression and refined for finite-sample coverage by conformal methods (Romano, Patterson and Candès, 2019; Xu and Xie, 2021; Gibbs and Candès, 2021). Those are acknowledged rather than adopted: conformal calibration needs a held-out set disjoint from both training data and evaluation window, and the pre-test sample here is committed in full to estimating models held fixed across the test period.</w:t>
-      </w:r>
-    </w:p>
-    <w:p>
-      <w:pPr>
-        <w:spacing w:line="360" w:lineRule="auto"/>
-      </w:pPr>
-      <w:r>
-        <w:t>CAViaR justifies training the LSTM to output conditional quantiles directly via the pinball loss rather than sampling a posterior. It imposes no distributional assumption and remains valid for heavy-tailed returns, but carries two caveats: the estimated quantiles are not guaranteed monotonic, and the intervals lack the finite-sample coverage guarantees of Bayesian or conformal procedures. Their empirical coverage must be established rather than assumed, by procedures deferred to Chapter 3.</w:t>
-      </w:r>
-    </w:p>
-    <w:p>
-      <w:pPr>
-        <w:spacing w:line="360" w:lineRule="auto"/>
-      </w:pPr>
-      <w:r>
-        <w:t>Two recent studies bring these ideas onto realised volatility itself and are the dissertation's nearest probabilistic neighbours, each stopping short of the present design; Table 2.1 records what each omits. That the full stack composes is shown outside finance by Isik and Yalcinkaya (2026), who integrate regime detection, a bidirectional LSTM, Monte Carlo Dropout and quantile intervals end-to-end for wind-power forecasting, while its financial instantiation remains unoccupied.</w:t>
-      </w:r>
-    </w:p>
-    <w:p>
-      <w:pPr>
-        <w:spacing w:line="360" w:lineRule="auto"/>
-      </w:pPr>
-      <w:r>
-        <w:t>That the uncertainty dimension is itself under-developed in financial machine learning is underscored by Gunnarsson et al. (2024), who find deep recurrent models among the strongest realised-volatility forecasters yet explicitly identify probabilistic, uncertainty-aware machine learning as an open direction.</w:t>
+      <w:bookmarkStart w:id="7" w:name="forecast-evaluation-and-comparison"/>
+      <w:r>
+        <w:t>2.7 Forecast Evaluation and Comparison</w:t>
+      </w:r>
+      <w:bookmarkEnd w:id="7"/>
+    </w:p>
+    <w:p>
+      <w:pPr>
+        <w:spacing w:line="360" w:lineRule="auto"/>
+      </w:pPr>
+      <w:r>
+        <w:t>The standard apparatus for testing whether one forecast is more accurate than another is the pairwise test of Diebold and Mariano (1995), which asks whether the mean loss differential between two forecasts differs significantly from zero under a heteroskedasticity- and autocorrelation-consistent estimate of its long-run variance. It suits volatility forecasting because it accommodates non-Gaussian loss differentials and non-nested comparisons (Gu, Kelly and Xiu, 2020; Makridakis et al., 2020).</w:t>
+      </w:r>
+    </w:p>
+    <w:p>
+      <w:pPr>
+        <w:spacing w:line="360" w:lineRule="auto"/>
+      </w:pPr>
+      <w:r>
+        <w:t>The dissertation uses it as its primary pairwise test, with QLIKE following Patton (2011). Because the pipeline compares many models, pairwise testing invites multiple-comparison error, so superiority is also assessed with the Model Confidence Set (Hansen, Lunde and Nason, 2011). Giacomini and White (2006) refine the framework for the long-memory loss series typical of volatility, and their conditional test asks the sharper question of whether the better model is predictable from the state known at the forecast origin — the form RQ2 takes. One condition of that refinement is not satisfied uniformly here, since it assumes a finite estimation window and the econometric baselines are re-estimated on an expanding one; Chapter 3 records the qualification.</w:t>
+      </w:r>
+    </w:p>
+    <w:p>
+      <w:pPr>
+        <w:spacing w:line="360" w:lineRule="auto"/>
+      </w:pPr>
+      <w:r>
+        <w:t>The criteria for the uncertainty-aware variants come from Gneiting and Raftery (2007), the canonical reference for evaluating probabilistic forecasts. They formalise the strictly proper scoring rule — a loss whose expected value is minimised at the true predictive distribution — and develop the continuous ranked probability score and the interval (Winkler) score as integrated criteria rewarding both location and spread. The principle they crystallise is that a probabilistic forecast cannot be judged by its point estimate alone: two forecasts with identical means may differ substantially in tail behaviour, and therefore in economic value to a risk manager sizing positions or setting capital.</w:t>
+      </w:r>
+    </w:p>
+    <w:p>
+      <w:pPr>
+        <w:spacing w:line="360" w:lineRule="auto"/>
+      </w:pPr>
+      <w:r>
+        <w:t>A distinct literature evaluates interval forecasts as value-at-risk backtests and supplies three criteria Chapter 3 applies. Kupiec (1995) tests whether the unconditional rate of violations matches its nominal level; Christoffersen (1998) extends this to conditional coverage by testing their independence, so a band with the right average rate but clustered breaches is rejected; and the dynamic-quantile regression of Engle and Manganelli (2004) asks whether violations are predictable at the forecast origin. Applied across methods, levels and tails they form a family subject to multiple-comparison error, which the Holm (1979) correction controls.</w:t>
       </w:r>
     </w:p>
     <w:p>
@@ -530,136 +438,31 @@
         <w:pStyle w:val="Heading2"/>
         <w:spacing w:line="360" w:lineRule="auto"/>
       </w:pPr>
-      <w:bookmarkStart w:id="7" w:name="forecast-evaluation-and-comparison"/>
-      <w:r>
-        <w:t>2.7 Forecast Evaluation and Comparison</w:t>
-      </w:r>
-      <w:bookmarkEnd w:id="7"/>
-    </w:p>
-    <w:p>
-      <w:pPr>
-        <w:spacing w:line="360" w:lineRule="auto"/>
-      </w:pPr>
-      <w:r>
-        <w:t>The standard apparatus for testing whether one forecast is more accurate than another is the pairwise test of Diebold and Mariano (1995), which asks whether the mean loss differential between two forecasts differs significantly from zero under a heteroskedasticity- and autocorrelation-consistent estimate of its long-run variance. It suits volatility forecasting because it accommodates non-Gaussian loss differentials and non-nested comparisons (Gu, Kelly and Xiu, 2020; Makridakis et al., 2020).</w:t>
-      </w:r>
-    </w:p>
-    <w:p>
-      <w:pPr>
-        <w:spacing w:line="360" w:lineRule="auto"/>
-      </w:pPr>
-      <w:r>
-        <w:t>The dissertation uses it as its primary pairwise test, with QLIKE following Patton (2011). Because the pipeline compares many models, pairwise testing invites multiple-comparison error, so superiority is also assessed with the Model Confidence Set (Hansen, Lunde and Nason, 2011). Giacomini and White (2006) refine the framework for the long-memory loss series typical of volatility, and their conditional test asks the sharper question of whether the better model is predictable from the state known at the forecast origin — the form RQ2 takes. One condition of that refinement is not satisfied uniformly here, since it assumes a finite estimation window and the econometric baselines are re-estimated on an expanding one; Chapter 3 records the qualification.</w:t>
-      </w:r>
-      <w:r/>
-    </w:p>
-    <w:p>
-      <w:pPr>
-        <w:spacing w:line="360" w:lineRule="auto"/>
-      </w:pPr>
-      <w:r>
-        <w:t>The criteria for the uncertainty-aware variants come from Gneiting and Raftery (2007), the canonical reference for evaluating probabilistic forecasts. They formalise the strictly proper scoring rule — a loss whose expected value is minimised at the true predictive distribution — and develop the continuous ranked probability score and the interval (Winkler) score as integrated criteria rewarding both location and spread.</w:t>
-      </w:r>
-    </w:p>
-    <w:p>
-      <w:pPr>
-        <w:spacing w:line="360" w:lineRule="auto"/>
-      </w:pPr>
-      <w:r>
-        <w:t>The principle they crystallise is that a probabilistic forecast cannot be judged by its point estimate alone: two forecasts with identical means may differ substantially in tail behaviour, and therefore in economic value to a risk manager sizing positions or setting capital. Coverage, sharpness and a proper score are accordingly reported alongside point accuracy, which is treated as necessary but not sufficient.</w:t>
-      </w:r>
-    </w:p>
-    <w:p>
-      <w:pPr>
-        <w:spacing w:line="360" w:lineRule="auto"/>
-      </w:pPr>
-      <w:r>
-        <w:t>A distinct literature evaluates interval forecasts as value-at-risk backtests and supplies three criteria Chapter 3 applies. Kupiec (1995) tests whether the unconditional rate of violations matches its nominal level; Christoffersen (1998) extends this to conditional coverage by testing their independence, so a band with the right average rate but clustered breaches is rejected; and the dynamic-quantile regression of Engle and Manganelli (2004) asks whether violations are predictable at the forecast origin. Applied across methods, levels and tails they form a family subject to multiple-comparison error, which the Holm (1979) correction controls.</w:t>
-      </w:r>
-    </w:p>
-    <w:p>
-      <w:pPr>
-        <w:pStyle w:val="Heading2"/>
-        <w:spacing w:line="360" w:lineRule="auto"/>
-      </w:pPr>
       <w:bookmarkStart w:id="8" w:name="synthesis-and-identified-gap"/>
-      <w:r>
-        <w:t>2.8 Synthesis and Identified Gap</w:t>
-      </w:r>
       <w:bookmarkEnd w:id="8"/>
-    </w:p>
-    <w:p>
-      <w:pPr>
-        <w:spacing w:line="360" w:lineRule="auto"/>
-      </w:pPr>
-      <w:r>
-        <w:t xml:space="preserve">The four traditions describe a coherent landscape whose components have not been integrated into one empirical pipeline for daily realised-volatility forecasting on a major US equity index. The </w:t>
+      <w:r>
+        <w:t>2.8 Synthesis, Identified Gap and Summary</w:t>
+      </w:r>
+    </w:p>
+    <w:p>
+      <w:pPr>
+        <w:spacing w:line="360" w:lineRule="auto"/>
+      </w:pPr>
+      <w:r>
+        <w:t>The four traditions describe a coherent landscape whose components have not been integrated into one empirical pipeline for daily realised-volatility forecasting on a major US equity index. The regime-switching machinery for extracting persistent states is almost always paired with parametric rather than neural models; LSTMs have matched or modestly exceeded econometric baselines (Kim and Won, 2018; Bucci, 2020) but rarely on daily realised volatility for a major US index and rarely conditioned on regime; and the two routes to calibrated predictive distributions (Gal and Ghahramani, 2016; Engle and Manganelli, 2004) are benchmarked mostly on general tasks. Across all four the evidence is uneven, and so indicative rather than decisive here.</w:t>
+      </w:r>
+    </w:p>
+    <w:p>
+      <w:pPr>
+        <w:spacing w:line="360" w:lineRule="auto"/>
+      </w:pPr>
+      <w:r>
+        <w:t xml:space="preserve">The gap is therefore one of </w:t>
       </w:r>
       <w:r>
         <w:rPr>
           <w:b/>
         </w:rPr>
-        <w:t>parametric econometric</w:t>
-      </w:r>
-      <w:r>
-        <w:t xml:space="preserve"> tradition (Engle, 1982; Bollerslev, 1986; Nelson, 1991; Corsi, 2009) supplies the benchmarks, to be measured under proxy-robust losses (Patton, 2011) and significance tests (Diebold and Mariano, 1995).</w:t>
-      </w:r>
-    </w:p>
-    <w:p>
-      <w:pPr>
-        <w:spacing w:line="360" w:lineRule="auto"/>
-      </w:pPr>
-      <w:r>
-        <w:t xml:space="preserve">The </w:t>
-      </w:r>
-      <w:r>
-        <w:rPr>
-          <w:b/>
-        </w:rPr>
-        <w:t>regime-switching</w:t>
-      </w:r>
-      <w:r>
-        <w:t xml:space="preserve"> tradition (Hamilton, 1989; Nystrup, Lindström and Madsen, 2020) supplies mature machinery for extracting persistent states, but almost always paired with parametric rather than neural models. The </w:t>
-      </w:r>
-      <w:r>
-        <w:rPr>
-          <w:b/>
-        </w:rPr>
-        <w:t>deep-learning</w:t>
-      </w:r>
-      <w:r>
-        <w:t xml:space="preserve"> tradition (Hochreiter and Schmidhuber, 1997; Lim and Zohren, 2021) has shown LSTMs matching or modestly exceeding econometric baselines (Kim and Won, 2018; Bucci, 2020), but rarely on daily realised volatility for a major US index and rarely conditioned on regime.</w:t>
-      </w:r>
-    </w:p>
-    <w:p>
-      <w:pPr>
-        <w:spacing w:line="360" w:lineRule="auto"/>
-      </w:pPr>
-      <w:r>
-        <w:lastRenderedPageBreak/>
-        <w:t xml:space="preserve">The </w:t>
-      </w:r>
-      <w:r>
-        <w:rPr>
-          <w:b/>
-        </w:rPr>
-        <w:t>probabilistic / uncertainty-quantification</w:t>
-      </w:r>
-      <w:r>
-        <w:t xml:space="preserve"> tradition provides two routes to calibrated predictive distributions — Monte Carlo Dropout (Gal and Ghahramani, 2016) and pinball-loss quantile regression (Engle and Manganelli, 2004) — evaluated against proper scoring rules (Gneiting and Raftery, 2007), but benchmarked mostly on general tasks. Across all four the evidence is uneven, and so indicative rather than decisive here.</w:t>
-      </w:r>
-    </w:p>
-    <w:p>
-      <w:pPr>
-        <w:spacing w:line="360" w:lineRule="auto"/>
-      </w:pPr>
-      <w:r>
-        <w:t xml:space="preserve">The gap is therefore one of </w:t>
-      </w:r>
-      <w:r>
-        <w:rPr>
-          <w:b/>
-        </w:rPr>
         <w:t>integration</w:t>
       </w:r>
       <w:r>
@@ -671,15 +474,7 @@
         <w:spacing w:line="360" w:lineRule="auto"/>
       </w:pPr>
       <w:r>
-        <w:t>The proposed pipeline assembles GARCH(1,1), EGARCH and HAR-RV as parametric baselines, an unconditional LSTM as a non-linear sequence baseline, two regime-aware LSTMs conditioned on a jump-penalised Gaussian-emission HMM, and uncertainty-aware variants using Monte Carlo Dropout and pinball-loss quantile regression. All are evaluated on the same out-of-sample window under QLIKE and MSE, with Diebold-Mariano tests for point forecasts and proper-score diagnostics for the probabilistic variants. The aim is not a novel architecture but a rigorous test of the integrated pipeline.</w:t>
-      </w:r>
-    </w:p>
-    <w:p>
-      <w:pPr>
-        <w:spacing w:line="360" w:lineRule="auto"/>
-      </w:pPr>
-      <w:r>
-        <w:t>Table 2.1 places the dissertation against its nearest neighbours and makes the boundary precise: each occupies part of the pipeline, none the whole of it. To the best of this review — extensive but not exhaustive — no study combines a regime-conditioned LSTM with dual uncertainty quantification for equity realised volatility on the Oxford-Man Realized Library under Model-Confidence-Set and interval-coverage evaluation. That intersection, integrative rather than methodological, is what the dissertation claims.</w:t>
+        <w:t>Table 2.1 places the dissertation against its nearest neighbours and makes the boundary precise: each occupies part of the pipeline, none the whole of it. To the best of this review — extensive but not exhaustive — no study combines a regime-conditioned LSTM with dual uncertainty quantification for equity realised volatility on the Oxford-Man Realized Library under Model-Confidence-Set and interval-coverage evaluation. That intersection, integrative rather than methodological, is what the dissertation claims: the aim is not a novel architecture but a rigorous test of the integrated pipeline, which Chapter 3 specifies.</w:t>
       </w:r>
     </w:p>
     <w:p>
@@ -2317,7 +2112,7 @@
               <w:rPr>
                 <w:sz w:val="18"/>
               </w:rPr>
-              <w:t>S&amp;P 500 daily RV (Oxford-Man)</w:t>
+              <w:t>S&amp;P 500 daily RV (Oxford-Man); Russell 2000 and FTSE 100 transfer check</w:t>
             </w:r>
           </w:p>
         </w:tc>

</xml_diff>